<commit_message>
Update 250 package: 세신 option + 템플스테이 replacing 한의원
Co-Authored-By: Claude Sonnet 4.6 <noreply@anthropic.com>
Claude-Session: https://claude.ai/code/session_01MLXVgnN287g9x8qaYbB4vD
</commit_message>
<xml_diff>
--- a/packages/고객공유용_250만원_SeoulTraditionalBeauty.docx
+++ b/packages/고객공유용_250만원_SeoulTraditionalBeauty.docx
@@ -1020,7 +1020,19 @@
                 <w:b/>
                 <w:sz w:val="18"/>
               </w:rPr>
-              <w:t>황토팩 전신케어 or 효소찜질 (선택 1)</w:t>
+              <w:t>효소찜질 or 황토팩 or 1인 세신 (선택 1)</w:t>
+            </w:r>
+          </w:p>
+          <w:p>
+            <w:pPr>
+              <w:spacing w:before="20" w:after="20"/>
+            </w:pPr>
+            <w:r>
+              <w:rPr>
+                <w:rFonts w:ascii="Malgun Gothic" w:hAnsi="Malgun Gothic"/>
+                <w:sz w:val="18"/>
+              </w:rPr>
+              <w:t>· 효소찜질 — 발효 효소 찜질, 체온 상승·노폐물 배출</w:t>
             </w:r>
           </w:p>
           <w:p>
@@ -1044,7 +1056,7 @@
                 <w:rFonts w:ascii="Malgun Gothic" w:hAnsi="Malgun Gothic"/>
                 <w:sz w:val="18"/>
               </w:rPr>
-              <w:t>· 효소찜질 — 발효 효소 찜질, 체온 상승·노폐물 배출</w:t>
+              <w:t>· 1인 세신 — 전통 이탈리아 타월 전신 세신, 각질 제거</w:t>
             </w:r>
           </w:p>
           <w:p>
@@ -1114,7 +1126,7 @@
                 <w:rFonts w:ascii="Malgun Gothic" w:hAnsi="Malgun Gothic"/>
                 <w:sz w:val="18"/>
               </w:rPr>
-              <w:t>💡 한방 성분으로 피부 속부터 정화 — 내일 촬영 전 최상의 피부 준비</w:t>
+              <w:t>💡 취향에 맞게 몸 안팎 정화 — 내일 촬영 전 최상의 피부 준비</w:t>
             </w:r>
           </w:p>
         </w:tc>
@@ -1294,7 +1306,7 @@
               <w:br/>
               <w:t>~</w:t>
               <w:br/>
-              <w:t>17:30</w:t>
+              <w:t>18:00</w:t>
             </w:r>
           </w:p>
         </w:tc>
@@ -1312,7 +1324,7 @@
                 <w:b/>
                 <w:sz w:val="18"/>
               </w:rPr>
-              <w:t>한의원 약침 + 쑥뜸</w:t>
+              <w:t>당일 템플스테이 (은평 한옥마을)</w:t>
             </w:r>
           </w:p>
           <w:p>
@@ -1324,7 +1336,7 @@
                 <w:rFonts w:ascii="Malgun Gothic" w:hAnsi="Malgun Gothic"/>
                 <w:sz w:val="18"/>
               </w:rPr>
-              <w:t>· 피부 약침 — 콜라겐 재생·탄력</w:t>
+              <w:t>· 은평 한옥마을 사찰 방문</w:t>
             </w:r>
           </w:p>
           <w:p>
@@ -1336,7 +1348,31 @@
                 <w:rFonts w:ascii="Malgun Gothic" w:hAnsi="Malgun Gothic"/>
                 <w:sz w:val="18"/>
               </w:rPr>
-              <w:t>· 전통 쑥뜸 시술</w:t>
+              <w:t>· 스님 or 법사 안내 명상 체험</w:t>
+            </w:r>
+          </w:p>
+          <w:p>
+            <w:pPr>
+              <w:spacing w:before="20" w:after="20"/>
+            </w:pPr>
+            <w:r>
+              <w:rPr>
+                <w:rFonts w:ascii="Malgun Gothic" w:hAnsi="Malgun Gothic"/>
+                <w:sz w:val="18"/>
+              </w:rPr>
+              <w:t>· 불교 다도 + 사찰 음식 체험</w:t>
+            </w:r>
+          </w:p>
+          <w:p>
+            <w:pPr>
+              <w:spacing w:before="20" w:after="20"/>
+            </w:pPr>
+            <w:r>
+              <w:rPr>
+                <w:rFonts w:ascii="Malgun Gothic" w:hAnsi="Malgun Gothic"/>
+                <w:sz w:val="18"/>
+              </w:rPr>
+              <w:t>· 조용한 공간에서 하루 마무리 명상</w:t>
             </w:r>
           </w:p>
           <w:p>
@@ -1371,7 +1407,7 @@
                 <w:rFonts w:ascii="Malgun Gothic" w:hAnsi="Malgun Gothic"/>
                 <w:sz w:val="18"/>
               </w:rPr>
-              <w:t>① 강남 경희한의원  ② 명동 자생한의원  ③ 아이 한의원</w:t>
+              <w:t>① 은평 진관사  ② 은평 한옥마을 템플  ③ 북한산 삼천사</w:t>
             </w:r>
           </w:p>
           <w:p>
@@ -1383,7 +1419,7 @@
                 <w:rFonts w:ascii="Malgun Gothic" w:hAnsi="Malgun Gothic"/>
                 <w:sz w:val="18"/>
               </w:rPr>
-              <w:t>④ 피부한의원 명동  ⑤ 동의보감한의원</w:t>
+              <w:t>④ 진관사 당일 체험  ⑤ 은평 문화원 한옥 프로그램</w:t>
             </w:r>
           </w:p>
           <w:p>
@@ -1406,7 +1442,19 @@
                 <w:rFonts w:ascii="Malgun Gothic" w:hAnsi="Malgun Gothic"/>
                 <w:sz w:val="18"/>
               </w:rPr>
-              <w:t>💡 한방으로 피부 내부 강화 — 촬영 전날 최상의 컨디션</w:t>
+              <w:t>💡 바쁜 여행 일정 속 깊은 휴식.</w:t>
+            </w:r>
+          </w:p>
+          <w:p>
+            <w:pPr>
+              <w:spacing w:before="20" w:after="20"/>
+            </w:pPr>
+            <w:r>
+              <w:rPr>
+                <w:rFonts w:ascii="Malgun Gothic" w:hAnsi="Malgun Gothic"/>
+                <w:sz w:val="18"/>
+              </w:rPr>
+              <w:t xml:space="preserve">   한국 전통 불교 문화를 직접 체험하는 특별한 경험</w:t>
             </w:r>
           </w:p>
         </w:tc>
@@ -2180,7 +2228,7 @@
         <w:rPr>
           <w:rFonts w:ascii="Malgun Gothic" w:hAnsi="Malgun Gothic"/>
         </w:rPr>
-        <w:t>DAY2  황토팩 전신케어 or 효소찜질 (선택)</w:t>
+        <w:t>DAY2  효소찜질 or 황토팩 or 1인 세신 (선택)</w:t>
       </w:r>
     </w:p>
     <w:p>
@@ -2202,7 +2250,7 @@
         <w:rPr>
           <w:rFonts w:ascii="Malgun Gothic" w:hAnsi="Malgun Gothic"/>
         </w:rPr>
-        <w:t>DAY2  한의원 약침 + 쑥뜸</w:t>
+        <w:t>DAY2  당일 템플스테이 (은평 한옥마을)</w:t>
       </w:r>
     </w:p>
     <w:p>
@@ -2683,7 +2731,7 @@
                 <w:rFonts w:ascii="Malgun Gothic" w:hAnsi="Malgun Gothic"/>
                 <w:sz w:val="20"/>
               </w:rPr>
-              <w:t>황토팩 or 효소찜질</w:t>
+              <w:t>효소찜질 or 황토팩 or 1인 세신</w:t>
             </w:r>
           </w:p>
         </w:tc>
@@ -2743,7 +2791,7 @@
                 <w:rFonts w:ascii="Malgun Gothic" w:hAnsi="Malgun Gothic"/>
                 <w:sz w:val="20"/>
               </w:rPr>
-              <w:t>한의원 약침 + 쑥뜸</w:t>
+              <w:t>당일 템플스테이 (은평 한옥마을)</w:t>
             </w:r>
           </w:p>
         </w:tc>
@@ -2757,7 +2805,7 @@
                 <w:rFonts w:ascii="Malgun Gothic" w:hAnsi="Malgun Gothic"/>
                 <w:sz w:val="20"/>
               </w:rPr>
-              <w:t>₩80,000</w:t>
+              <w:t>₩50,000</w:t>
             </w:r>
           </w:p>
         </w:tc>
@@ -2937,7 +2985,7 @@
                 <w:rFonts w:ascii="Malgun Gothic" w:hAnsi="Malgun Gothic"/>
                 <w:sz w:val="20"/>
               </w:rPr>
-              <w:t>₩1,575,000</w:t>
+              <w:t>₩1,545,000</w:t>
             </w:r>
           </w:p>
         </w:tc>
@@ -2967,7 +3015,7 @@
                 <w:rFonts w:ascii="Malgun Gothic" w:hAnsi="Malgun Gothic"/>
                 <w:sz w:val="20"/>
               </w:rPr>
-              <w:t>63.0% ⚠️</w:t>
+              <w:t>61.8% ⚠️</w:t>
             </w:r>
           </w:p>
         </w:tc>

</xml_diff>

<commit_message>
Change 에스테틱 to included in ₩2,500,000 package
Co-Authored-By: Claude Sonnet 4.6 <noreply@anthropic.com>
Claude-Session: https://claude.ai/code/session_01MLXVgnN287g9x8qaYbB4vD
</commit_message>
<xml_diff>
--- a/packages/고객공유용_250만원_SeoulTraditionalBeauty.docx
+++ b/packages/고객공유용_250만원_SeoulTraditionalBeauty.docx
@@ -396,7 +396,7 @@
                 <w:rFonts w:ascii="Malgun Gothic" w:hAnsi="Malgun Gothic"/>
                 <w:sz w:val="18"/>
               </w:rPr>
-              <w:t>💳 현장결제</w:t>
+              <w:t>✅ 포함</w:t>
             </w:r>
           </w:p>
         </w:tc>
@@ -2184,6 +2184,17 @@
         <w:rPr>
           <w:rFonts w:ascii="Malgun Gothic" w:hAnsi="Malgun Gothic"/>
         </w:rPr>
+        <w:t>DAY1  에스테틱</w:t>
+      </w:r>
+    </w:p>
+    <w:p>
+      <w:pPr>
+        <w:pStyle w:val="ListBullet"/>
+      </w:pPr>
+      <w:r>
+        <w:rPr>
+          <w:rFonts w:ascii="Malgun Gothic" w:hAnsi="Malgun Gothic"/>
+        </w:rPr>
         <w:t>DAY1  프리미엄 한복 대여</w:t>
       </w:r>
     </w:p>
@@ -2462,36 +2473,6 @@
                 <w:rFonts w:ascii="Malgun Gothic" w:hAnsi="Malgun Gothic"/>
                 <w:sz w:val="20"/>
               </w:rPr>
-              <w:t>에스테틱 시술비</w:t>
-            </w:r>
-          </w:p>
-        </w:tc>
-        <w:tc>
-          <w:tcPr>
-            <w:tcW w:type="dxa" w:w="4320"/>
-          </w:tcPr>
-          <w:p>
-            <w:r>
-              <w:rPr>
-                <w:rFonts w:ascii="Malgun Gothic" w:hAnsi="Malgun Gothic"/>
-                <w:sz w:val="20"/>
-              </w:rPr>
-              <w:t>💳 현장결제</w:t>
-            </w:r>
-          </w:p>
-        </w:tc>
-      </w:tr>
-      <w:tr>
-        <w:tc>
-          <w:tcPr>
-            <w:tcW w:type="dxa" w:w="4320"/>
-          </w:tcPr>
-          <w:p>
-            <w:r>
-              <w:rPr>
-                <w:rFonts w:ascii="Malgun Gothic" w:hAnsi="Malgun Gothic"/>
-                <w:sz w:val="20"/>
-              </w:rPr>
               <w:t>명동 병원 시술비</w:t>
             </w:r>
           </w:p>
@@ -2626,6 +2607,36 @@
                 <w:sz w:val="20"/>
               </w:rPr>
               <w:t>₩260,000</w:t>
+            </w:r>
+          </w:p>
+        </w:tc>
+      </w:tr>
+      <w:tr>
+        <w:tc>
+          <w:tcPr>
+            <w:tcW w:type="dxa" w:w="4320"/>
+          </w:tcPr>
+          <w:p>
+            <w:r>
+              <w:rPr>
+                <w:rFonts w:ascii="Malgun Gothic" w:hAnsi="Malgun Gothic"/>
+                <w:sz w:val="20"/>
+              </w:rPr>
+              <w:t>에스테틱</w:t>
+            </w:r>
+          </w:p>
+        </w:tc>
+        <w:tc>
+          <w:tcPr>
+            <w:tcW w:type="dxa" w:w="4320"/>
+          </w:tcPr>
+          <w:p>
+            <w:r>
+              <w:rPr>
+                <w:rFonts w:ascii="Malgun Gothic" w:hAnsi="Malgun Gothic"/>
+                <w:sz w:val="20"/>
+              </w:rPr>
+              <w:t>₩80,000</w:t>
             </w:r>
           </w:p>
         </w:tc>
@@ -2985,7 +2996,7 @@
                 <w:rFonts w:ascii="Malgun Gothic" w:hAnsi="Malgun Gothic"/>
                 <w:sz w:val="20"/>
               </w:rPr>
-              <w:t>₩1,545,000</w:t>
+              <w:t>₩1,625,000</w:t>
             </w:r>
           </w:p>
         </w:tc>
@@ -3015,7 +3026,7 @@
                 <w:rFonts w:ascii="Malgun Gothic" w:hAnsi="Malgun Gothic"/>
                 <w:sz w:val="20"/>
               </w:rPr>
-              <w:t>61.8% ⚠️</w:t>
+              <w:t>65.0% ⚠️</w:t>
             </w:r>
           </w:p>
         </w:tc>

</xml_diff>

<commit_message>
Reorder DAY2: templestay first, replace 다도+사주 with 사주 only
Co-Authored-By: Claude Sonnet 4.6 <noreply@anthropic.com>
Claude-Session: https://claude.ai/code/session_01MLXVgnN287g9x8qaYbB4vD
</commit_message>
<xml_diff>
--- a/packages/고객공유용_250만원_SeoulTraditionalBeauty.docx
+++ b/packages/고객공유용_250만원_SeoulTraditionalBeauty.docx
@@ -852,11 +852,11 @@
                 <w:rFonts w:ascii="Malgun Gothic" w:hAnsi="Malgun Gothic"/>
                 <w:sz w:val="18"/>
               </w:rPr>
-              <w:t>10:00</w:t>
+              <w:t>09:30</w:t>
               <w:br/>
               <w:t>~</w:t>
               <w:br/>
-              <w:t>11:30</w:t>
+              <w:t>13:30</w:t>
             </w:r>
           </w:p>
         </w:tc>
@@ -874,7 +874,7 @@
                 <w:b/>
                 <w:sz w:val="18"/>
               </w:rPr>
-              <w:t>다도 체험 + 사주</w:t>
+              <w:t>당일 템플스테이 (은평 한옥마을)  (4시간)</w:t>
             </w:r>
           </w:p>
           <w:p>
@@ -886,7 +886,7 @@
                 <w:rFonts w:ascii="Malgun Gothic" w:hAnsi="Malgun Gothic"/>
                 <w:sz w:val="18"/>
               </w:rPr>
-              <w:t>· 전통 다구 사용법 + 명상 다도 (1시간)</w:t>
+              <w:t>· 09:30  접수 및 오리엔테이션</w:t>
             </w:r>
           </w:p>
           <w:p>
@@ -898,7 +898,55 @@
                 <w:rFonts w:ascii="Malgun Gothic" w:hAnsi="Malgun Gothic"/>
                 <w:sz w:val="18"/>
               </w:rPr>
-              <w:t>· 전통 사주 분석 (통역 포함, 30분)</w:t>
+              <w:t>· 10:00  사찰 안내 및 역사 소개</w:t>
+            </w:r>
+          </w:p>
+          <w:p>
+            <w:pPr>
+              <w:spacing w:before="20" w:after="20"/>
+            </w:pPr>
+            <w:r>
+              <w:rPr>
+                <w:rFonts w:ascii="Malgun Gothic" w:hAnsi="Malgun Gothic"/>
+                <w:sz w:val="18"/>
+              </w:rPr>
+              <w:t>· 10:30  참선 (명상)</w:t>
+            </w:r>
+          </w:p>
+          <w:p>
+            <w:pPr>
+              <w:spacing w:before="20" w:after="20"/>
+            </w:pPr>
+            <w:r>
+              <w:rPr>
+                <w:rFonts w:ascii="Malgun Gothic" w:hAnsi="Malgun Gothic"/>
+                <w:sz w:val="18"/>
+              </w:rPr>
+              <w:t>· 11:10  스님과 차담</w:t>
+            </w:r>
+          </w:p>
+          <w:p>
+            <w:pPr>
+              <w:spacing w:before="20" w:after="20"/>
+            </w:pPr>
+            <w:r>
+              <w:rPr>
+                <w:rFonts w:ascii="Malgun Gothic" w:hAnsi="Malgun Gothic"/>
+                <w:sz w:val="18"/>
+              </w:rPr>
+              <w:t>· 11:40  사찰 음식 (공양)</w:t>
+            </w:r>
+          </w:p>
+          <w:p>
+            <w:pPr>
+              <w:spacing w:before="20" w:after="20"/>
+            </w:pPr>
+            <w:r>
+              <w:rPr>
+                <w:rFonts w:ascii="Malgun Gothic" w:hAnsi="Malgun Gothic"/>
+                <w:sz w:val="18"/>
+              </w:rPr>
+              <w:t>· 12:30  자유 산책 및 회향</w:t>
             </w:r>
           </w:p>
           <w:p>
@@ -933,7 +981,7 @@
                 <w:rFonts w:ascii="Malgun Gothic" w:hAnsi="Malgun Gothic"/>
                 <w:sz w:val="18"/>
               </w:rPr>
-              <w:t>① 인사동 다도원  ② 차마시는 뜰  ③ 오설록 티하우스</w:t>
+              <w:t>① 은평 진관사  ② 북한산 삼천사  ③ 봉은사</w:t>
             </w:r>
           </w:p>
           <w:p>
@@ -945,7 +993,7 @@
                 <w:rFonts w:ascii="Malgun Gothic" w:hAnsi="Malgun Gothic"/>
                 <w:sz w:val="18"/>
               </w:rPr>
-              <w:t>④ 전통찻집 귀천  ⑤ 명가원</w:t>
+              <w:t>④ 길상사  ⑤ 조계사</w:t>
             </w:r>
           </w:p>
           <w:p>
@@ -968,7 +1016,19 @@
                 <w:rFonts w:ascii="Malgun Gothic" w:hAnsi="Malgun Gothic"/>
                 <w:sz w:val="18"/>
               </w:rPr>
-              <w:t>💡 하루를 여는 명상 다도 — 전통 문화의 깊이를 먼저 경험</w:t>
+              <w:t>💡 바쁜 여행 일정 속 진짜 쉬어가는 시간.</w:t>
+            </w:r>
+          </w:p>
+          <w:p>
+            <w:pPr>
+              <w:spacing w:before="20" w:after="20"/>
+            </w:pPr>
+            <w:r>
+              <w:rPr>
+                <w:rFonts w:ascii="Malgun Gothic" w:hAnsi="Malgun Gothic"/>
+                <w:sz w:val="18"/>
+              </w:rPr>
+              <w:t xml:space="preserve">   참선·차담·사찰음식으로 한국 불교 문화를 온몸으로 경험</w:t>
             </w:r>
           </w:p>
         </w:tc>
@@ -998,11 +1058,157 @@
                 <w:rFonts w:ascii="Malgun Gothic" w:hAnsi="Malgun Gothic"/>
                 <w:sz w:val="18"/>
               </w:rPr>
-              <w:t>12:00</w:t>
+              <w:t>14:00</w:t>
               <w:br/>
               <w:t>~</w:t>
               <w:br/>
-              <w:t>13:30</w:t>
+              <w:t>15:00</w:t>
+            </w:r>
+          </w:p>
+        </w:tc>
+        <w:tc>
+          <w:tcPr>
+            <w:tcW w:type="dxa" w:w="6520"/>
+          </w:tcPr>
+          <w:p>
+            <w:pPr>
+              <w:spacing w:before="20" w:after="20"/>
+            </w:pPr>
+            <w:r>
+              <w:rPr>
+                <w:rFonts w:ascii="Malgun Gothic" w:hAnsi="Malgun Gothic"/>
+                <w:b/>
+                <w:sz w:val="18"/>
+              </w:rPr>
+              <w:t>사주 (1시간)</w:t>
+            </w:r>
+          </w:p>
+          <w:p>
+            <w:pPr>
+              <w:spacing w:before="20" w:after="20"/>
+            </w:pPr>
+            <w:r>
+              <w:rPr>
+                <w:rFonts w:ascii="Malgun Gothic" w:hAnsi="Malgun Gothic"/>
+                <w:sz w:val="18"/>
+              </w:rPr>
+              <w:t>· 전통 사주 분석 (통역 포함)</w:t>
+            </w:r>
+          </w:p>
+          <w:p>
+            <w:pPr>
+              <w:spacing w:before="20" w:after="20"/>
+            </w:pPr>
+            <w:r>
+              <w:rPr>
+                <w:rFonts w:ascii="Malgun Gothic" w:hAnsi="Malgun Gothic"/>
+                <w:sz w:val="18"/>
+              </w:rPr>
+              <w:t>· 생년월일 기반 사주팔자 풀이</w:t>
+            </w:r>
+          </w:p>
+          <w:p>
+            <w:pPr>
+              <w:spacing w:before="20" w:after="20"/>
+            </w:pPr>
+            <w:r>
+              <w:rPr>
+                <w:rFonts w:ascii="Malgun Gothic" w:hAnsi="Malgun Gothic"/>
+                <w:sz w:val="18"/>
+              </w:rPr>
+            </w:r>
+          </w:p>
+          <w:p>
+            <w:pPr>
+              <w:spacing w:before="20" w:after="20"/>
+            </w:pPr>
+            <w:r>
+              <w:rPr>
+                <w:rFonts w:ascii="Malgun Gothic" w:hAnsi="Malgun Gothic"/>
+                <w:sz w:val="18"/>
+              </w:rPr>
+              <w:t>추천 업체 TOP5</w:t>
+            </w:r>
+          </w:p>
+          <w:p>
+            <w:pPr>
+              <w:spacing w:before="20" w:after="20"/>
+            </w:pPr>
+            <w:r>
+              <w:rPr>
+                <w:rFonts w:ascii="Malgun Gothic" w:hAnsi="Malgun Gothic"/>
+                <w:sz w:val="18"/>
+              </w:rPr>
+              <w:t>① 인사동 사주카페  ② 명동 운세원  ③ 압구정 사주당</w:t>
+            </w:r>
+          </w:p>
+          <w:p>
+            <w:pPr>
+              <w:spacing w:before="20" w:after="20"/>
+            </w:pPr>
+            <w:r>
+              <w:rPr>
+                <w:rFonts w:ascii="Malgun Gothic" w:hAnsi="Malgun Gothic"/>
+                <w:sz w:val="18"/>
+              </w:rPr>
+              <w:t>④ 북촌 사주원  ⑤ 전통사주 인사동점</w:t>
+            </w:r>
+          </w:p>
+          <w:p>
+            <w:pPr>
+              <w:spacing w:before="20" w:after="20"/>
+            </w:pPr>
+            <w:r>
+              <w:rPr>
+                <w:rFonts w:ascii="Malgun Gothic" w:hAnsi="Malgun Gothic"/>
+                <w:sz w:val="18"/>
+              </w:rPr>
+            </w:r>
+          </w:p>
+          <w:p>
+            <w:pPr>
+              <w:spacing w:before="20" w:after="20"/>
+            </w:pPr>
+            <w:r>
+              <w:rPr>
+                <w:rFonts w:ascii="Malgun Gothic" w:hAnsi="Malgun Gothic"/>
+                <w:sz w:val="18"/>
+              </w:rPr>
+              <w:t>💡 템플스테이 후 차분한 마음 상태에서 사주 — 집중력이 높아 더 깊이 받아들여짐</w:t>
+            </w:r>
+          </w:p>
+        </w:tc>
+        <w:tc>
+          <w:tcPr>
+            <w:tcW w:type="dxa" w:w="1417"/>
+          </w:tcPr>
+          <w:p>
+            <w:r>
+              <w:rPr>
+                <w:rFonts w:ascii="Malgun Gothic" w:hAnsi="Malgun Gothic"/>
+                <w:sz w:val="18"/>
+              </w:rPr>
+              <w:t>✅ 포함</w:t>
+            </w:r>
+          </w:p>
+        </w:tc>
+      </w:tr>
+      <w:tr>
+        <w:tc>
+          <w:tcPr>
+            <w:tcW w:type="dxa" w:w="1134"/>
+          </w:tcPr>
+          <w:p>
+            <w:r>
+              <w:rPr>
+                <w:rFonts w:ascii="Malgun Gothic" w:hAnsi="Malgun Gothic"/>
+                <w:sz w:val="18"/>
+              </w:rPr>
+              <w:t>15:00</w:t>
+              <w:br/>
+              <w:t>~</w:t>
+              <w:br/>
+              <w:t>16:30</w:t>
             </w:r>
           </w:p>
         </w:tc>
@@ -1156,11 +1362,11 @@
                 <w:rFonts w:ascii="Malgun Gothic" w:hAnsi="Malgun Gothic"/>
                 <w:sz w:val="18"/>
               </w:rPr>
-              <w:t>14:00</w:t>
+              <w:t>17:00</w:t>
               <w:br/>
               <w:t>~</w:t>
               <w:br/>
-              <w:t>15:30</w:t>
+              <w:t>18:30</w:t>
             </w:r>
           </w:p>
         </w:tc>
@@ -1273,188 +1479,6 @@
                 <w:sz w:val="18"/>
               </w:rPr>
               <w:t>💡 한국 전통 발효 문화를 몸으로 배우는 시간</w:t>
-            </w:r>
-          </w:p>
-        </w:tc>
-        <w:tc>
-          <w:tcPr>
-            <w:tcW w:type="dxa" w:w="1417"/>
-          </w:tcPr>
-          <w:p>
-            <w:r>
-              <w:rPr>
-                <w:rFonts w:ascii="Malgun Gothic" w:hAnsi="Malgun Gothic"/>
-                <w:sz w:val="18"/>
-              </w:rPr>
-              <w:t>✅ 포함</w:t>
-            </w:r>
-          </w:p>
-        </w:tc>
-      </w:tr>
-      <w:tr>
-        <w:tc>
-          <w:tcPr>
-            <w:tcW w:type="dxa" w:w="1134"/>
-          </w:tcPr>
-          <w:p>
-            <w:r>
-              <w:rPr>
-                <w:rFonts w:ascii="Malgun Gothic" w:hAnsi="Malgun Gothic"/>
-                <w:sz w:val="18"/>
-              </w:rPr>
-              <w:t>16:00</w:t>
-              <w:br/>
-              <w:t>~</w:t>
-              <w:br/>
-              <w:t>18:00</w:t>
-            </w:r>
-          </w:p>
-        </w:tc>
-        <w:tc>
-          <w:tcPr>
-            <w:tcW w:type="dxa" w:w="6520"/>
-          </w:tcPr>
-          <w:p>
-            <w:pPr>
-              <w:spacing w:before="20" w:after="20"/>
-            </w:pPr>
-            <w:r>
-              <w:rPr>
-                <w:rFonts w:ascii="Malgun Gothic" w:hAnsi="Malgun Gothic"/>
-                <w:b/>
-                <w:sz w:val="18"/>
-              </w:rPr>
-              <w:t>당일 템플스테이 (은평 한옥마을)</w:t>
-            </w:r>
-          </w:p>
-          <w:p>
-            <w:pPr>
-              <w:spacing w:before="20" w:after="20"/>
-            </w:pPr>
-            <w:r>
-              <w:rPr>
-                <w:rFonts w:ascii="Malgun Gothic" w:hAnsi="Malgun Gothic"/>
-                <w:sz w:val="18"/>
-              </w:rPr>
-              <w:t>· 은평 한옥마을 사찰 방문</w:t>
-            </w:r>
-          </w:p>
-          <w:p>
-            <w:pPr>
-              <w:spacing w:before="20" w:after="20"/>
-            </w:pPr>
-            <w:r>
-              <w:rPr>
-                <w:rFonts w:ascii="Malgun Gothic" w:hAnsi="Malgun Gothic"/>
-                <w:sz w:val="18"/>
-              </w:rPr>
-              <w:t>· 스님 or 법사 안내 명상 체험</w:t>
-            </w:r>
-          </w:p>
-          <w:p>
-            <w:pPr>
-              <w:spacing w:before="20" w:after="20"/>
-            </w:pPr>
-            <w:r>
-              <w:rPr>
-                <w:rFonts w:ascii="Malgun Gothic" w:hAnsi="Malgun Gothic"/>
-                <w:sz w:val="18"/>
-              </w:rPr>
-              <w:t>· 불교 다도 + 사찰 음식 체험</w:t>
-            </w:r>
-          </w:p>
-          <w:p>
-            <w:pPr>
-              <w:spacing w:before="20" w:after="20"/>
-            </w:pPr>
-            <w:r>
-              <w:rPr>
-                <w:rFonts w:ascii="Malgun Gothic" w:hAnsi="Malgun Gothic"/>
-                <w:sz w:val="18"/>
-              </w:rPr>
-              <w:t>· 조용한 공간에서 하루 마무리 명상</w:t>
-            </w:r>
-          </w:p>
-          <w:p>
-            <w:pPr>
-              <w:spacing w:before="20" w:after="20"/>
-            </w:pPr>
-            <w:r>
-              <w:rPr>
-                <w:rFonts w:ascii="Malgun Gothic" w:hAnsi="Malgun Gothic"/>
-                <w:sz w:val="18"/>
-              </w:rPr>
-            </w:r>
-          </w:p>
-          <w:p>
-            <w:pPr>
-              <w:spacing w:before="20" w:after="20"/>
-            </w:pPr>
-            <w:r>
-              <w:rPr>
-                <w:rFonts w:ascii="Malgun Gothic" w:hAnsi="Malgun Gothic"/>
-                <w:sz w:val="18"/>
-              </w:rPr>
-              <w:t>추천 업체 TOP5</w:t>
-            </w:r>
-          </w:p>
-          <w:p>
-            <w:pPr>
-              <w:spacing w:before="20" w:after="20"/>
-            </w:pPr>
-            <w:r>
-              <w:rPr>
-                <w:rFonts w:ascii="Malgun Gothic" w:hAnsi="Malgun Gothic"/>
-                <w:sz w:val="18"/>
-              </w:rPr>
-              <w:t>① 은평 진관사  ② 은평 한옥마을 템플  ③ 북한산 삼천사</w:t>
-            </w:r>
-          </w:p>
-          <w:p>
-            <w:pPr>
-              <w:spacing w:before="20" w:after="20"/>
-            </w:pPr>
-            <w:r>
-              <w:rPr>
-                <w:rFonts w:ascii="Malgun Gothic" w:hAnsi="Malgun Gothic"/>
-                <w:sz w:val="18"/>
-              </w:rPr>
-              <w:t>④ 진관사 당일 체험  ⑤ 은평 문화원 한옥 프로그램</w:t>
-            </w:r>
-          </w:p>
-          <w:p>
-            <w:pPr>
-              <w:spacing w:before="20" w:after="20"/>
-            </w:pPr>
-            <w:r>
-              <w:rPr>
-                <w:rFonts w:ascii="Malgun Gothic" w:hAnsi="Malgun Gothic"/>
-                <w:sz w:val="18"/>
-              </w:rPr>
-            </w:r>
-          </w:p>
-          <w:p>
-            <w:pPr>
-              <w:spacing w:before="20" w:after="20"/>
-            </w:pPr>
-            <w:r>
-              <w:rPr>
-                <w:rFonts w:ascii="Malgun Gothic" w:hAnsi="Malgun Gothic"/>
-                <w:sz w:val="18"/>
-              </w:rPr>
-              <w:t>💡 바쁜 여행 일정 속 깊은 휴식.</w:t>
-            </w:r>
-          </w:p>
-          <w:p>
-            <w:pPr>
-              <w:spacing w:before="20" w:after="20"/>
-            </w:pPr>
-            <w:r>
-              <w:rPr>
-                <w:rFonts w:ascii="Malgun Gothic" w:hAnsi="Malgun Gothic"/>
-                <w:sz w:val="18"/>
-              </w:rPr>
-              <w:t xml:space="preserve">   한국 전통 불교 문화를 직접 체험하는 특별한 경험</w:t>
             </w:r>
           </w:p>
         </w:tc>
@@ -2228,7 +2252,18 @@
         <w:rPr>
           <w:rFonts w:ascii="Malgun Gothic" w:hAnsi="Malgun Gothic"/>
         </w:rPr>
-        <w:t>DAY2  다도 체험 + 사주</w:t>
+        <w:t>DAY2  당일 템플스테이 (은평 한옥마을)</w:t>
+      </w:r>
+    </w:p>
+    <w:p>
+      <w:pPr>
+        <w:pStyle w:val="ListBullet"/>
+      </w:pPr>
+      <w:r>
+        <w:rPr>
+          <w:rFonts w:ascii="Malgun Gothic" w:hAnsi="Malgun Gothic"/>
+        </w:rPr>
+        <w:t>DAY2  사주</w:t>
       </w:r>
     </w:p>
     <w:p>
@@ -2712,7 +2747,7 @@
                 <w:rFonts w:ascii="Malgun Gothic" w:hAnsi="Malgun Gothic"/>
                 <w:sz w:val="20"/>
               </w:rPr>
-              <w:t>다도 체험 + 사주</w:t>
+              <w:t>사주</w:t>
             </w:r>
           </w:p>
         </w:tc>
@@ -2726,7 +2761,7 @@
                 <w:rFonts w:ascii="Malgun Gothic" w:hAnsi="Malgun Gothic"/>
                 <w:sz w:val="20"/>
               </w:rPr>
-              <w:t>₩50,000</w:t>
+              <w:t>₩30,000</w:t>
             </w:r>
           </w:p>
         </w:tc>
@@ -2996,7 +3031,7 @@
                 <w:rFonts w:ascii="Malgun Gothic" w:hAnsi="Malgun Gothic"/>
                 <w:sz w:val="20"/>
               </w:rPr>
-              <w:t>₩1,625,000</w:t>
+              <w:t>₩1,605,000</w:t>
             </w:r>
           </w:p>
         </w:tc>
@@ -3026,7 +3061,7 @@
                 <w:rFonts w:ascii="Malgun Gothic" w:hAnsi="Malgun Gothic"/>
                 <w:sz w:val="20"/>
               </w:rPr>
-              <w:t>65.0% ⚠️</w:t>
+              <w:t>64.2% ⚠️</w:t>
             </w:r>
           </w:p>
         </w:tc>

</xml_diff>